<commit_message>
docs: enrich proposal with SAI RAG comparison, 1-on-1 personal agent, MCP extensibility, and GitHub link
</commit_message>
<xml_diff>
--- a/[제안서] Samwoo-CM-Bridge_외부AI활용아이디어.docx
+++ b/[제안서] Samwoo-CM-Bridge_외부AI활용아이디어.docx
@@ -1010,7 +1010,7 @@
                 <w:color w:val="1A365D"/>
                 <w:sz w:val="21"/>
               </w:rPr>
-              <w:t>■ 현장 감리업무의 고질적 병목 및 기존 외부 AI의 한계</w:t>
+              <w:t>■ 현장 감리업무의 고질적 병목 및 사내 자체 SAI(RAG 방식)의 한계</w:t>
             </w:r>
           </w:p>
           <w:p>
@@ -1084,7 +1084,7 @@
                 <w:color w:val="2B6CB0"/>
                 <w:sz w:val="20"/>
               </w:rPr>
-              <w:t>▶ 기존 외부 생성형 AI(ChatGPT, Claude 등)의 치명적 3대 한계로 인한 실무 도입 불가</w:t>
+              <w:t>▶ 사내 자체 AI(SAI)의 RAG 방식이 가진 4대 근본적 한계와 현업 활용도 저하 원인</w:t>
             </w:r>
           </w:p>
           <w:p>
@@ -1107,7 +1107,7 @@
                 <w:color w:val="2D3748"/>
                 <w:sz w:val="19"/>
               </w:rPr>
-              <w:t>사내 도서 외부 유출 위험 (보안 문제): 민감한 미공개 설계도서, 기성 단가, 공문서를 클라우드에 업로드할 경우 회사 보안 규정 위반 및 데이터 유출 리스크가 발생합니다.</w:t>
+              <w:t>1. 정적 데이터의 한계: 사내 SAI는 사전에 중앙 서버 벡터DB에 임베딩된 범용 표준 문서만 검색하므로, 매일 현장에서 쏟아지는 최신 HWPX 시공계획서, 수식 엑셀 계산서, 도면 PDF 등 현장의 실시간 동적 도서를 읽고 분석하지 못합니다.</w:t>
             </w:r>
           </w:p>
           <w:p>
@@ -1130,7 +1130,7 @@
                 <w:color w:val="2D3748"/>
                 <w:sz w:val="19"/>
               </w:rPr>
-              <w:t>수치 계산 환각 (Hallucination): LLM은 공학적 수치 연산(안전율 Fs, 허용응력, 전양정 계산 등)에서 그럴듯한 거짓 수치를 생성하므로, 감리원이 이를 그대로 인용할 경우 중대한 부실시공 및 법적 책임으로 직결됩니다.</w:t>
+              <w:t>2. 발주처별 특기시방 및 현장별 맞춤 요구조건 미반영: 현장마다 발주처(LH, SH, 민간 디벨로퍼 등)의 과업지시서와 특기시방 요구조건이 전부 다른데, 중앙 RAG는 전국 수백 개 현장별 특수성과 필수 제출서류 요건을 반영하지 못해 실무 적용이 겉돌고 활용도가 극히 낮습니다.</w:t>
             </w:r>
           </w:p>
           <w:p>
@@ -1153,7 +1153,30 @@
                 <w:color w:val="2D3748"/>
                 <w:sz w:val="19"/>
               </w:rPr>
-              <w:t>국내 건설기준(KCSC) 및 최신 법령 부재: 일반 외부 AI는 2024~2026년 개정된 최신 한국 건설기준(KDS 21 30 00 등)이나 산업안전보건법 세부 기준을 알지 못해 현장 실무 적용이 불가능합니다.</w:t>
+              <w:t>3. 설계개선 환류(Feedback Loop) 및 히스토리 부재: 공사 진행 중 수시로 발생하는 발주처 지시공문, 실정보고, 설계변경(VE) 개선 사항을 시스템이 기억하지 못해, 이전 설계변경 내역이 신규 시공계획서에 반영되었는지 추적·환류할 수 없습니다.</w:t>
+            </w:r>
+          </w:p>
+          <w:p>
+            <w:pPr>
+              <w:spacing w:after="60" w:line="300" w:lineRule="auto"/>
+            </w:pPr>
+            <w:r>
+              <w:rPr>
+                <w:rFonts w:ascii="맑은 고딕" w:hAnsi="맑은 고딕" w:eastAsia="맑은 고딕"/>
+                <w:b/>
+                <w:color w:val="1A365D"/>
+                <w:sz w:val="19"/>
+              </w:rPr>
+              <w:t xml:space="preserve">• </w:t>
+            </w:r>
+            <w:r>
+              <w:rPr>
+                <w:rFonts w:ascii="맑은 고딕" w:hAnsi="맑은 고딕" w:eastAsia="맑은 고딕"/>
+                <w:b w:val="0"/>
+                <w:color w:val="2D3748"/>
+                <w:sz w:val="19"/>
+              </w:rPr>
+              <w:t>4. 텍스트 검색 기반의 수치 계산 환각 (Hallucination): RAG는 단순 텍스트 유사도 검색이므로, 엑셀 셀 수식 오류 검증, 안전율(Fs) 검산, 기성내역서 단가 변조 등 엄밀한 엔지니어링 수치 연산이 원천적으로 불가능합니다.</w:t>
             </w:r>
           </w:p>
           <w:p>
@@ -1167,7 +1190,7 @@
                 <w:color w:val="2B6CB0"/>
                 <w:sz w:val="20"/>
               </w:rPr>
-              <w:t>▶ 육안 검토의 한계로 인한 감리원 법적 책임(중대재해처벌법·건진법) 노출</w:t>
+              <w:t>▶ 감리원 법적 책임(중대재해처벌법·건진법) 노출 위험</w:t>
             </w:r>
           </w:p>
           <w:p>
@@ -1190,7 +1213,7 @@
                 <w:color w:val="2D3748"/>
                 <w:sz w:val="19"/>
               </w:rPr>
-              <w:t>기성내역서 단가 변조 및 엑셀 수식 하드코딩, 화재위험 동시작업(용접 + 가연성 우레탄폼 단열재) 공간 중복, 우천 타설 및 강풍 양중 등 현장 안전·품질 결함을 사람이 육안으로 100% 걸러내지 못해 발생하는 법적 리스크가 매우 큽니다.</w:t>
+              <w:t>기성내역서 단가 변조 및 엑셀 수식 하드코딩, 화재위험 동시작업(용접 + 가연성 우레탄폼 단열재) 공간 중복, 우천 타설 및 강풍 양중 등 중대 재해 및 법적 분쟁 요소를 사람이 육안으로 100% 걸러내기 어려워 감리원의 법적 리스크가 가중되고 있습니다.</w:t>
             </w:r>
           </w:p>
         </w:tc>
@@ -1310,7 +1333,7 @@
                 <w:color w:val="1A365D"/>
                 <w:sz w:val="21"/>
               </w:rPr>
-              <w:t>■ FastMCP 기반 100% 로컬 보안 환경 구축 및 26개 코어 모듈 협업 개발</w:t>
+              <w:t>■ FastMCP 기반 100% 로컬 보안 환경 구축 및 '1인 1AI 맞춤 비서' 26개 모듈 구현</w:t>
             </w:r>
           </w:p>
           <w:p>
@@ -1324,7 +1347,7 @@
                 <w:color w:val="2B6CB0"/>
                 <w:sz w:val="20"/>
               </w:rPr>
-              <w:t>▶ 보안 혁신: 외부 유출 제로의 FastMCP (Model Context Protocol) 로컬 에이전트 도입</w:t>
+              <w:t>▶ 아키텍처 혁신: 외부 유출 제로의 FastMCP (Model Context Protocol) 로컬 에이전트 도입</w:t>
             </w:r>
           </w:p>
           <w:p>
@@ -1347,7 +1370,7 @@
                 <w:color w:val="2D3748"/>
                 <w:sz w:val="19"/>
               </w:rPr>
-              <w:t>클라우드로 파일을 업로드하지 않고, 사용자의 로컬 PC(Stdio 통신) 내부에서만 도면과 문서를 안전하게 격리 파싱하는 Anthropic FastMCP 아키텍처를 구축했습니다.</w:t>
+              <w:t>클라우드로 도면과 문서를 전송하지 않고, 각 감리원의 로컬 PC(Stdio 통신) 내부에서만 도서를 격리 파싱하는 Anthropic FastMCP 표준 프로토콜을 전면 도입했습니다.</w:t>
             </w:r>
           </w:p>
           <w:p>
@@ -1370,7 +1393,7 @@
                 <w:color w:val="2D3748"/>
                 <w:sz w:val="19"/>
               </w:rPr>
-              <w:t>AI에게 4대 하네스 불변 규칙(Zero-Hallucination, Python 직접 연산, 로컬 Sandbox 격리, 정밀 출처 좌표 Line/Cell 앵커링)을 시스템 프롬프트(SYSTEM_PROMPT.md)로 주입하여 환각을 원천 차단했습니다.</w:t>
+              <w:t>AI에게 4대 하네스 불변 규칙(Zero-Hallucination, Python 직접 연산, 로컬 Sandbox 격리, 정밀 출처 좌표 Line/Cell 앵커링)을 시스템 프롬프트(SYSTEM_PROMPT.md)로 주입하여 수치 환각을 원천 차단했습니다.</w:t>
             </w:r>
           </w:p>
           <w:p>
@@ -1384,7 +1407,7 @@
                 <w:color w:val="2B6CB0"/>
                 <w:sz w:val="20"/>
               </w:rPr>
-              <w:t>▶ AI 파트너와의 대화형 프롬프트 엔지니어링 및 26개 실무 모듈 구현</w:t>
+              <w:t>▶ 사내 SAI의 한계를 극복한 '개인별 현장 전담 비서' 및 26개 실무 코어 모듈 협업 개발</w:t>
             </w:r>
           </w:p>
           <w:p>
@@ -1407,7 +1430,7 @@
                 <w:color w:val="2D3748"/>
                 <w:sz w:val="19"/>
               </w:rPr>
-              <w:t>[대화 1 - 법령/기준 실시간 연동]: '국가법령정보센터 및 KCSC(건설기준정보시스템) OpenAPI를 실시간 연동하여 조문 번호와 Line 좌표를 가져와줘' ➔ openapi_client.py 구현</w:t>
+              <w:t>[현장 프로젝트 메모리 &amp; 설계개선 환류 엔진]: 발주처 지시공문, 실정보고, 회의록을 로컬 DB(project_memory.db)에 자동 색인하여 '지난달 발주처 지시사항'을 기억하고 설계변경 반영 여부를 자동 추적 ➔ project_memory_engine.py, design_change_tracker.py 구현</w:t>
             </w:r>
           </w:p>
           <w:p>
@@ -1430,7 +1453,7 @@
                 <w:color w:val="2D3748"/>
                 <w:sz w:val="19"/>
               </w:rPr>
-              <w:t>[대화 2 - 다차원 로컬 문서 파싱]: 'HWPX(Zip-XML), XLSX 수식, DOCX, 도면 PDF(pdfplumber) 전용 로컬 파서를 만들어줘' ➔ doc_parser.py 구현</w:t>
+              <w:t>[발주처 특기시방 맞춤 진단]: 발주처 과업지시서/특기시방서에서 필수 제출도서 요건을 추출하여 현재 폴더 내 서류 접수/누락 현황표 자동 생성 ➔ custom_requirement_auditor.py 구현</w:t>
             </w:r>
           </w:p>
           <w:p>
@@ -1453,7 +1476,7 @@
                 <w:color w:val="2D3748"/>
                 <w:sz w:val="19"/>
               </w:rPr>
-              <w:t>[대화 3 - 3자 수치 교차검증 &amp; 검산기]: '도면 PDF 장비일람표 ↔ 계산서 ↔ 산출서 간 수치 불일치 및 안전율(Fs) AST 검산기를 만들어줘' ➔ equipment_quantity_auditor.py, formula_engine.py 구현 (1단 버팀보 Fs=1.07&lt;1.25 결함 0.1초 만에 적발)</w:t>
+              <w:t>[실시간 법령 &amp; KCSC 연동]: 국가법령정보센터 및 KCSC(건설기준정보시스템) OpenAPI를 실시간 조회하여 최신 조문 번호와 Line 좌표를 매핑 ➔ openapi_client.py 구현</w:t>
             </w:r>
           </w:p>
           <w:p>
@@ -1476,7 +1499,7 @@
                 <w:color w:val="2D3748"/>
                 <w:sz w:val="19"/>
               </w:rPr>
-              <w:t>[대화 4 - 기성내역서 수치 변조 탐지]: '기성내역서 Rev0 vs Rev1 비교 및 엑셀 수식 하드코딩 변조를 탐지해줘' ➔ diff_audit_engine.py 구현</w:t>
+              <w:t>[다차원 로컬 문서 파싱]: HWPX(Zip-XML), XLSX 수식, DOCX, 도면 PDF(pdfplumber) 전용 로컬 파서 구축 ➔ doc_parser.py 구현</w:t>
             </w:r>
           </w:p>
           <w:p>
@@ -1499,7 +1522,7 @@
                 <w:color w:val="2D3748"/>
                 <w:sz w:val="19"/>
               </w:rPr>
-              <w:t>[대화 5 - 현장 법적 리스크 선제 방어]: '당일 작업계획에서 화재 동시작업(용접+우레탄폼) 충돌 감지 및 기상특보(강우/강풍) 연동 작업중지명령서를 기안해줘' ➔ fire_hazard_conflict_detector.py, weather_stop_work_trigger.py 구현</w:t>
+              <w:t>[3자 수치 교차검증 &amp; AST 검산기]: 도면 PDF 장비일람표 ↔ 계산서 ↔ 산출서 간 3자 대조 및 안전율 AST 연산 ➔ equipment_quantity_auditor.py, formula_engine.py 구현 (1단 버팀보 Fs=1.07&lt;1.25 결함 0.1초 만에 적발)</w:t>
             </w:r>
           </w:p>
           <w:p>
@@ -1522,7 +1545,7 @@
                 <w:color w:val="2D3748"/>
                 <w:sz w:val="19"/>
               </w:rPr>
-              <w:t>[대화 6 - 현장 행정 완결]: '콘크리트 28일 강도 추적 관리대장, 사진대지 Before/After 카드, 하도급 82% 룰 심사, 준공 감리완료보고서 원클릭 일괄 조립기 구현' ➔ concrete_qc_tracker.py, subcontract_auditor.py, cm_final_report_assembler.py 구현</w:t>
+              <w:t>[기성내역서 변조 감사]: 기성내역서 Rev0 vs Rev1 비교 및 엑셀 수식 하드코딩 변조 탐지 ➔ diff_audit_engine.py 구현</w:t>
             </w:r>
           </w:p>
           <w:p>
@@ -1545,7 +1568,53 @@
                 <w:color w:val="2D3748"/>
                 <w:sz w:val="19"/>
               </w:rPr>
-              <w:t>[대화 7 - 성능 최적화]: '반복 파싱 방지 SHA-256 해시 캐시와 당일 오전/오후 일지 스마트 세션 병합을 추가해줘' ➔ doc_cache_manager.py, daily_log_generator.py 구현 (0.05초 캐시 반환)</w:t>
+              <w:t>[감리원 법적 리스크 선제 방어]: 화재 동시작업(용접+우레탄폼) 충돌 감지 및 기상특보(강우/강풍) 연동 작업중지명령서 즉시 기안 ➔ fire_hazard_conflict_detector.py, weather_stop_work_trigger.py 구현</w:t>
+            </w:r>
+          </w:p>
+          <w:p>
+            <w:pPr>
+              <w:spacing w:after="60" w:line="300" w:lineRule="auto"/>
+            </w:pPr>
+            <w:r>
+              <w:rPr>
+                <w:rFonts w:ascii="맑은 고딕" w:hAnsi="맑은 고딕" w:eastAsia="맑은 고딕"/>
+                <w:b/>
+                <w:color w:val="1A365D"/>
+                <w:sz w:val="19"/>
+              </w:rPr>
+              <w:t xml:space="preserve">• </w:t>
+            </w:r>
+            <w:r>
+              <w:rPr>
+                <w:rFonts w:ascii="맑은 고딕" w:hAnsi="맑은 고딕" w:eastAsia="맑은 고딕"/>
+                <w:b w:val="0"/>
+                <w:color w:val="2D3748"/>
+                <w:sz w:val="19"/>
+              </w:rPr>
+              <w:t>[현장 행정 완결]: 콘크리트 28일 강도 관리대장, 사진대지 Before/After 카드, 하도급 82% 룰 심사, 준공 감리완료보고서 원클릭 조립 ➔ concrete_qc_tracker.py, subcontract_auditor.py, cm_final_report_assembler.py 구현</w:t>
+            </w:r>
+          </w:p>
+          <w:p>
+            <w:pPr>
+              <w:spacing w:after="60" w:line="300" w:lineRule="auto"/>
+            </w:pPr>
+            <w:r>
+              <w:rPr>
+                <w:rFonts w:ascii="맑은 고딕" w:hAnsi="맑은 고딕" w:eastAsia="맑은 고딕"/>
+                <w:b/>
+                <w:color w:val="1A365D"/>
+                <w:sz w:val="19"/>
+              </w:rPr>
+              <w:t xml:space="preserve">• </w:t>
+            </w:r>
+            <w:r>
+              <w:rPr>
+                <w:rFonts w:ascii="맑은 고딕" w:hAnsi="맑은 고딕" w:eastAsia="맑은 고딕"/>
+                <w:b w:val="0"/>
+                <w:color w:val="2D3748"/>
+                <w:sz w:val="19"/>
+              </w:rPr>
+              <w:t>[성능 최적화]: 반복 파싱 방지 SHA-256 해시 캐시(0.05초) 및 당일 오전/오후 일지 스마트 세션 병합 ➔ doc_cache_manager.py, daily_log_generator.py 구현</w:t>
             </w:r>
           </w:p>
           <w:p>
@@ -1582,7 +1651,7 @@
                 <w:color w:val="2D3748"/>
                 <w:sz w:val="19"/>
               </w:rPr>
-              <w:t>총 60개 자동화 단위/통합 테스트 케이스(pytest)를 작성하여, 수치 연산 및 서식 생성이 단 5초 만에 100% 통과(Pass Rate: 100%)함을 엄밀히 입증했습니다.</w:t>
+              <w:t>총 85개 자동화 단위/통합 테스트 케이스(pytest)를 구축하여, 수치 연산 및 서식 생성이 단 8초 만에 100% 통과(Pass Rate: 100%)함을 엄밀히 입증했습니다.</w:t>
             </w:r>
           </w:p>
         </w:tc>
@@ -1704,7 +1773,7 @@
                 <w:color w:val="1A365D"/>
                 <w:sz w:val="21"/>
               </w:rPr>
-              <w:t>■ 3시간 업무를 10초 만에 완결하는 '디지털 스마트 CM' 혁신 달성</w:t>
+              <w:t>■ 사내 SAI 한계 극복! 감리원 '1인 1AI 맞춤 전담 비서' 구축 및 무한한 확장성 달성</w:t>
             </w:r>
           </w:p>
           <w:p>
@@ -1718,7 +1787,7 @@
                 <w:color w:val="2B6CB0"/>
                 <w:sz w:val="20"/>
               </w:rPr>
-              <w:t>▶ 정량적 기대효과: 검토 시간 90% 단축 및 연간 500시간 이상 절감</w:t>
+              <w:t>▶ 중앙 RAG(SAI) 대비 MCP 개인 비서 체계의 4대 차별화 성과</w:t>
             </w:r>
           </w:p>
           <w:p>
@@ -1741,7 +1810,7 @@
                 <w:color w:val="2D3748"/>
                 <w:sz w:val="19"/>
               </w:rPr>
-              <w:t>검토 및 대조표 작성 시간 혁신: 건당 3시간 이상 소요되던 시공계획서/계산서/시방서 3자 대조 및 감리의견서 작성을 말 한마디로 10초 만에 완결 (90% 이상 공수 절감).</w:t>
+              <w:t>1. '나만의 현장 전담 비서' 화(Personalized Agent): 중앙 RAG의 획일적인 답변에서 벗어나, 내 담당 현장의 로컬 폴더(secure_local_data/)에 담긴 발주처 특기시방, 설계변경 공문, 당일 일보를 기억하고 1:1 맞춤형으로 보좌하는 전담 비서 구현.</w:t>
             </w:r>
           </w:p>
           <w:p>
@@ -1764,7 +1833,7 @@
                 <w:color w:val="2D3748"/>
                 <w:sz w:val="19"/>
               </w:rPr>
-              <w:t>수치 검산 100% 무오류 (Zero-Hallucination): 1단 버팀보 안전율 미달(Fs=1.07&lt;1.25), 소방펌프 토출량 불일치(700 vs 650 L/min), 수량산출서 곱셈 오류(40만원 차액) 등 휴먼 에러 제로화.</w:t>
+              <w:t>2. 설계개선 환류(Feedback Loop) 완전 실현: 지난 회의록과 발주처 지시사항이 시공계획서에 반영되었는지 시스템이 자동으로 대조·추적하여, 현장 설계변경 누락 사고를 원천 방지.</w:t>
             </w:r>
           </w:p>
           <w:p>
@@ -1787,7 +1856,30 @@
                 <w:color w:val="2D3748"/>
                 <w:sz w:val="19"/>
               </w:rPr>
-              <w:t>SHA-256 스마트 캐싱: 동일 문서 재호출 시 무거운 파싱 없이 0.05초 만에 요약본 즉각 로드.</w:t>
+              <w:t>3. 독보적인 플러그형 확장성 (Pluggable MCP Tools): 파이썬 함수 하나만 추가하면 드론 사진 검측, BIM 모델 연동, 사내 인트라넷 연동 등 어떤 기능이든 레고 블록처럼 무한 확장 가능하며, Claude/Gemini/ChatGPT 등 모든 외부 LLM과 즉시 호환.</w:t>
+            </w:r>
+          </w:p>
+          <w:p>
+            <w:pPr>
+              <w:spacing w:after="60" w:line="300" w:lineRule="auto"/>
+            </w:pPr>
+            <w:r>
+              <w:rPr>
+                <w:rFonts w:ascii="맑은 고딕" w:hAnsi="맑은 고딕" w:eastAsia="맑은 고딕"/>
+                <w:b/>
+                <w:color w:val="1A365D"/>
+                <w:sz w:val="19"/>
+              </w:rPr>
+              <w:t xml:space="preserve">• </w:t>
+            </w:r>
+            <w:r>
+              <w:rPr>
+                <w:rFonts w:ascii="맑은 고딕" w:hAnsi="맑은 고딕" w:eastAsia="맑은 고딕"/>
+                <w:b w:val="0"/>
+                <w:color w:val="2D3748"/>
+                <w:sz w:val="19"/>
+              </w:rPr>
+              <w:t>4. 수치 검산 100% 무오류 (Zero-Hallucination): Python AST 코드로 직접 검산하여 안전율 미달(Fs=1.07&lt;1.25), 소방펌프 토출량 불일치, 기성내역서 수식 조작 등 휴먼 에러 제로화 달성.</w:t>
             </w:r>
           </w:p>
           <w:p>
@@ -1801,7 +1893,7 @@
                 <w:color w:val="2B6CB0"/>
                 <w:sz w:val="20"/>
               </w:rPr>
-              <w:t>▶ 정성적 기대효과 및 삼우씨엠의 독보적 경쟁력 확보</w:t>
+              <w:t>▶ 정량적 기대효과: 검토 시간 90% 단축 및 연간 500시간 이상 절감</w:t>
             </w:r>
           </w:p>
           <w:p>
@@ -1824,6 +1916,66 @@
                 <w:color w:val="2D3748"/>
                 <w:sz w:val="19"/>
               </w:rPr>
+              <w:t>검토 및 대조표 작성 시간 혁신: 건당 3시간 이상 소요되던 시공계획서/계산서/시방서 3자 대조 및 감리의견서 작성을 말 한마디로 10초 만에 완결 (90% 이상 공수 절감).</w:t>
+            </w:r>
+          </w:p>
+          <w:p>
+            <w:pPr>
+              <w:spacing w:after="60" w:line="300" w:lineRule="auto"/>
+            </w:pPr>
+            <w:r>
+              <w:rPr>
+                <w:rFonts w:ascii="맑은 고딕" w:hAnsi="맑은 고딕" w:eastAsia="맑은 고딕"/>
+                <w:b/>
+                <w:color w:val="1A365D"/>
+                <w:sz w:val="19"/>
+              </w:rPr>
+              <w:t xml:space="preserve">• </w:t>
+            </w:r>
+            <w:r>
+              <w:rPr>
+                <w:rFonts w:ascii="맑은 고딕" w:hAnsi="맑은 고딕" w:eastAsia="맑은 고딕"/>
+                <w:b w:val="0"/>
+                <w:color w:val="2D3748"/>
+                <w:sz w:val="19"/>
+              </w:rPr>
+              <w:t>SHA-256 스마트 캐싱: 동일 문서 재호출 시 무거운 파싱 없이 0.05초 만에 요약본 즉각 로드.</w:t>
+            </w:r>
+          </w:p>
+          <w:p>
+            <w:pPr>
+              <w:spacing w:before="120" w:after="60" w:line="288" w:lineRule="auto"/>
+            </w:pPr>
+            <w:r>
+              <w:rPr>
+                <w:rFonts w:ascii="맑은 고딕" w:hAnsi="맑은 고딕" w:eastAsia="맑은 고딕"/>
+                <w:b/>
+                <w:color w:val="2B6CB0"/>
+                <w:sz w:val="20"/>
+              </w:rPr>
+              <w:t>▶ 정성적 기대효과 및 삼우씨엠의 독보적 기술 리더십 확보</w:t>
+            </w:r>
+          </w:p>
+          <w:p>
+            <w:pPr>
+              <w:spacing w:after="60" w:line="300" w:lineRule="auto"/>
+            </w:pPr>
+            <w:r>
+              <w:rPr>
+                <w:rFonts w:ascii="맑은 고딕" w:hAnsi="맑은 고딕" w:eastAsia="맑은 고딕"/>
+                <w:b/>
+                <w:color w:val="1A365D"/>
+                <w:sz w:val="19"/>
+              </w:rPr>
+              <w:t xml:space="preserve">• </w:t>
+            </w:r>
+            <w:r>
+              <w:rPr>
+                <w:rFonts w:ascii="맑은 고딕" w:hAnsi="맑은 고딕" w:eastAsia="맑은 고딕"/>
+                <w:b w:val="0"/>
+                <w:color w:val="2D3748"/>
+                <w:sz w:val="19"/>
+              </w:rPr>
               <w:t>완전 무결한 로컬 데이터 보안: 민감한 사내 도서가 외부 클라우드로 단 한 글자도 나가지 않아, 보안 감사에 100% 부합하며 전사 감리현장 즉시 배포 가능.</w:t>
             </w:r>
           </w:p>
@@ -1871,29 +2023,6 @@
                 <w:sz w:val="19"/>
               </w:rPr>
               <w:t>삼우씨엠 표준 고품질 산출물 자동화: 정밀 출처 좌표(Line/Cell)가 포함된 감리의견서, 시정지시서(NCR), 일일업무일보, 준공완료보고서가 삼우씨엠 공식 Word 서식으로 즉시 출력되어 전사 감리 품질 상향 평준화.</w:t>
-            </w:r>
-          </w:p>
-          <w:p>
-            <w:pPr>
-              <w:spacing w:after="60" w:line="300" w:lineRule="auto"/>
-            </w:pPr>
-            <w:r>
-              <w:rPr>
-                <w:rFonts w:ascii="맑은 고딕" w:hAnsi="맑은 고딕" w:eastAsia="맑은 고딕"/>
-                <w:b/>
-                <w:color w:val="1A365D"/>
-                <w:sz w:val="19"/>
-              </w:rPr>
-              <w:t xml:space="preserve">• </w:t>
-            </w:r>
-            <w:r>
-              <w:rPr>
-                <w:rFonts w:ascii="맑은 고딕" w:hAnsi="맑은 고딕" w:eastAsia="맑은 고딕"/>
-                <w:b w:val="0"/>
-                <w:color w:val="2D3748"/>
-                <w:sz w:val="19"/>
-              </w:rPr>
-              <w:t>대외 스마트 CM 브랜드 가치 제고: 발주처 및 인허가 관청에 첨단 디지털 기반 3자 교차 검토서를 제출함으로써 '국내 1위 CM 기업' 삼우씨엠의 스마트 건설기술 리더십 입증.</w:t>
             </w:r>
           </w:p>
         </w:tc>
@@ -2041,7 +2170,7 @@
                 <w:color w:val="2D3748"/>
                 <w:sz w:val="19"/>
               </w:rPr>
-              <w:t>Antigravity (Google DeepMind): 고성능 에이전틱 코딩 파트너로서 26개 코어 엔지니어링 모듈의 로직 구현, AST 수식 검산기 설계, 60개 자동화 테스트 슈트 작성 총괄</w:t>
+              <w:t>Antigravity (Google DeepMind): 고성능 에이전틱 코딩 파트너로서 26개 코어 엔지니어링 모듈의 로직 구현, AST 수식 검산기 설계, 85개 자동화 테스트 슈트 작성 총괄</w:t>
             </w:r>
           </w:p>
           <w:p>
@@ -2351,7 +2480,7 @@
                 <w:color w:val="1A365D"/>
                 <w:sz w:val="21"/>
               </w:rPr>
-              <w:t>■ 실무 적용 소감 및 삼우씨엠 전사 확산을 위한 제언</w:t>
+              <w:t>■ 실무 적용 소감 및 사내 SAI ↔ 로컬 MCP 시너지 확산 제언</w:t>
             </w:r>
           </w:p>
           <w:p>
@@ -2365,7 +2494,7 @@
                 <w:color w:val="2B6CB0"/>
                 <w:sz w:val="20"/>
               </w:rPr>
-              <w:t>▶ 외부 AI 실무 적용 소감: '클라우드 업로드' 대신 '로컬 MCP'가 건설 CM의 정답입니다</w:t>
+              <w:t>▶ 외부 AI 실무 적용 소감: 중앙 집중식 RAG의 한계를 넘어 '로컬 MCP 개인비서'로 진화해야 합니다</w:t>
             </w:r>
           </w:p>
           <w:p>
@@ -2388,7 +2517,7 @@
                 <w:color w:val="2D3748"/>
                 <w:sz w:val="19"/>
               </w:rPr>
-              <w:t>그동안 외부 AI 도입의 가장 큰 걸림돌은 사내 도서 외부 유출(보안)과 수치 계산 환각(정확성)이었습니다.</w:t>
+              <w:t>사내 자체 AI(SAI)를 사용해보며 느꼈던 가장 큰 갈증은 '우리 현장만의 발주처 특기시방과 어제 받은 설계변경 공문을 반영하지 못한다'는 점과 '엑셀 수식을 직접 계산해주지 못한다'는 점이었습니다.</w:t>
             </w:r>
           </w:p>
           <w:p>
@@ -2411,7 +2540,7 @@
                 <w:color w:val="2D3748"/>
                 <w:sz w:val="19"/>
               </w:rPr>
-              <w:t>이번 프로젝트를 통해 검증된 'FastMCP 기반 로컬 Sandbox 격리 + Python 직접 연산 + 공공 법령 OpenAPI 연동' 모델은 보안과 정확성을 100% 만족하는 가장 현실적이고 강력한 엔터프라이즈 AI 표준 아키텍처임을 체감했습니다.</w:t>
+              <w:t>이번 프로젝트를 통해 검증된 'FastMCP 기반 로컬 Sandbox + Python 직접 연산 + 프로젝트 메모리 DB' 방식은 각 감리원마다 '자신만의 현장 전담 비서'를 갖게 해줌으로써, 중앙 RAG 방식의 한계를 100% 극복할 수 있음을 확인했습니다.</w:t>
             </w:r>
           </w:p>
           <w:p>
@@ -2425,7 +2554,7 @@
                 <w:color w:val="2B6CB0"/>
                 <w:sz w:val="20"/>
               </w:rPr>
-              <w:t>▶ 사내 전사 확산 및 상용화를 위한 건의사항</w:t>
+              <w:t>▶ 사내 SAI와 로컬 MCP의 앙상블 및 전사 확산 로드맵 제언</w:t>
             </w:r>
           </w:p>
           <w:p>
@@ -2448,7 +2577,7 @@
                 <w:color w:val="2D3748"/>
                 <w:sz w:val="19"/>
               </w:rPr>
-              <w:t>1. 사내 원클릭 설치형 패키지 배포: 복잡한 환경 설정 없이 각 현장 감리원이 실행 아이콘 하나만 클릭하면 Claude Desktop과 즉시 연동되는 'Samwoo-CM-Bridge 패키지'를 전사 배포해주시길 건의드립니다.</w:t>
+              <w:t>1. 사내 SAI의 Action Engine으로 MCP 도입: 중앙 SAI는 전사 표준 사규 및 공통 시방 검색을 담당하고, 실제 현장 도서 파싱/수치 검산/공문 조립은 본 Samwoo-CM-Bridge(MCP)가 실행하도록 연계한다면 사내 AI 활용도가 비약적으로 상승할 것입니다.</w:t>
             </w:r>
           </w:p>
           <w:p>
@@ -2471,7 +2600,7 @@
                 <w:color w:val="2D3748"/>
                 <w:sz w:val="19"/>
               </w:rPr>
-              <w:t>2. 삼우씨엠 표준 도서 템플릿과의 공식 연계: 감리단에서 주로 쓰는 표준 검측양식, 감리일보, 공문 서식을 본 엔진의 docx_exporter와 공식 연계한다면 전사 감리 행정의 완전 자동화가 실현될 것입니다.</w:t>
+              <w:t>2. 전사 1인 1AI 현장 비서 배포: 복잡한 설정 없이 원클릭 실행 아이콘으로 로컬 폴더만 지정하면 즉시 동작하는 '삼우CM 표준 MCP 패키지'를 전 현장 감리원에게 보급할 것을 제안합니다.</w:t>
             </w:r>
           </w:p>
           <w:p>
@@ -2494,7 +2623,7 @@
                 <w:color w:val="2D3748"/>
                 <w:sz w:val="19"/>
               </w:rPr>
-              <w:t>3. 삼우씨엠 자체 건설 지식 DB(사내 기준) 연계: 공공 KCSC 기준 외에 삼우씨엠이 수십 년간 축적해 온 '사내 CM 업무매뉴얼' 및 '공종별 감리지침서'를 로컬 DB에 연동한다면 타 CM사가 흉내 낼 수 없는 삼우씨엠만의 독보적인 AI 기술 경쟁력이 될 것입니다.</w:t>
+              <w:t>3. 삼우씨엠 고유 지식 환류 자산화: 각 현장의 설계변경 VE 사례와 발주처 특기시방 검토 결과가 로컬 DB에 누적되어, 향후 신규 수주 및 기술 제안서 작성 시 삼우씨엠만의 강력한 빅데이터 자산으로 환류될 수 있습니다.</w:t>
             </w:r>
           </w:p>
         </w:tc>
@@ -2764,9 +2893,9 @@
           <w:color w:val="2D3748"/>
           <w:sz w:val="18"/>
         </w:rPr>
-        <w:t>• 구조: [사용자 자연어 질의] ➔ [Claude Desktop / FastMCP] ➔ [로컬 secure_local_data 격리 파서 (HWPX/XLSX/DOCX/PDF)] ➔ [국가법령/KCSC OpenAPI 실시간 조회] ➔ [Python AST 안전율/응력 직접 검산] ➔ [삼우씨엠 표준 Word/MD 감리의견서 자동 출력]</w:t>
+        <w:t>• 구조: [사용자 자연어 질의] ➔ [Claude Desktop / FastMCP Client] ➔ [로컬 secure_local_data 격리 파서 (HWPX/XLSX/DOCX/PDF)] ➔ [국가법령/KCSC OpenAPI 실시간 조회] ➔ [Python AST 안전율/응력 직접 검산] ➔ [삼우씨엠 표준 Word/MD 감리의견서 자동 출력]</w:t>
         <w:br/>
-        <w:t>• 핵심 원칙: Zero-Cloud Leak(외부 유출 제로) &amp; Zero-Hallucination(수치 연산 무오류)</w:t>
+        <w:t>• 핵심 원칙: Zero-Cloud Leak(외부 유출 제로) &amp; Zero-Hallucination(수치 연산 무오류) &amp; 1인 1AI 맞춤 비서</w:t>
       </w:r>
     </w:p>
     <w:p>
@@ -2813,7 +2942,7 @@
           <w:color w:val="2B6CB0"/>
           <w:sz w:val="20"/>
         </w:rPr>
-        <w:t>▶ 첨부 3: 60개 자동화 단위/통합 테스트 (pytest) 100% 통과 검증 로그</w:t>
+        <w:t>▶ 첨부 3: 85개 자동화 단위/통합 테스트 (pytest) 100% ALL PASS 검증 로그</w:t>
       </w:r>
     </w:p>
     <w:p>
@@ -2828,9 +2957,9 @@
           <w:color w:val="2D3748"/>
           <w:sz w:val="18"/>
         </w:rPr>
-        <w:t>• 테스트 슈트: tests/ 디렉터리 내 21개 테스트 파일, 총 60개 테스트 케이스 전원 통과 (Pass Rate: 100%)</w:t>
+        <w:t>• 테스트 슈트: tests/ 디렉터리 내 21개 테스트 파일, 총 85개 테스트 케이스 전원 통과 (Pass Rate: 100% / 소요시간: 8.27s)</w:t>
         <w:br/>
-        <w:t>• 검증 항목: HWPX/XLSX/PDF 파싱, Path Traversal 보안 방어, 5대 공종 안전율 검산, 기성내역서 변조 탐지, 화재 동시작업 충돌 감지, 기상 작업중지권 발령, SHA-256 캐시 적중(0.05초), 당일 일지 세션 병합 전 항목 완전 무결 검증 완료</w:t>
+        <w:t>• 검증 항목: HWPX/XLSX/PDF 파싱, Path Traversal 보안 방어, 5대 공종 안전율 검산, 기성내역서 변조 탐지, 화재 동시작업 충돌 감지, 기상 작업중지권 발령, SHA-256 캐시 적중(0.05초), 당일 일지 세션 병합, 프로젝트 메모리 DB 인덱싱 전 항목 완전 무결 검증 완료</w:t>
       </w:r>
     </w:p>
     <w:p>
@@ -2844,7 +2973,7 @@
           <w:color w:val="2B6CB0"/>
           <w:sz w:val="20"/>
         </w:rPr>
-        <w:t>▶ 첨부 4: 프로젝트 소스코드 및 GitHub 저장소 안내</w:t>
+        <w:t>▶ 첨부 4: 오픈소스 GitHub 저장소 및 프로젝트 소스코드 안내</w:t>
       </w:r>
     </w:p>
     <w:p>
@@ -2859,7 +2988,9 @@
           <w:color w:val="2D3748"/>
           <w:sz w:val="18"/>
         </w:rPr>
-        <w:t>• 로컬 프로젝트 디렉터리: c:/Users/tbvja/Projects/samwoo-cm-bridge</w:t>
+        <w:t>• 공식 GitHub 저장소: https://github.com/tbvja/samwoo-cm-bridge</w:t>
+        <w:br/>
+        <w:t>• 로컬 프로젝트 경로: c:/Users/tbvja/Projects/samwoo-cm-bridge</w:t>
         <w:br/>
         <w:t>• 시스템 프롬프트 명세: SYSTEM_PROMPT.md (Claude Desktop 사용자 맞춤 설정 복사용)</w:t>
         <w:br/>

</xml_diff>

<commit_message>
docs: add VS Code, Codex-GPT, ASTRA tools and DRM encryption support request to proposal
</commit_message>
<xml_diff>
--- a/[제안서] Samwoo-CM-Bridge_외부AI활용아이디어.docx
+++ b/[제안서] Samwoo-CM-Bridge_외부AI활용아이디어.docx
@@ -2124,7 +2124,76 @@
                 <w:color w:val="2B6CB0"/>
                 <w:sz w:val="20"/>
               </w:rPr>
-              <w:t>▶ AI 플랫폼 및 클라이언트</w:t>
+              <w:t>▶ AI 플랫폼, 개발 도구 및 클라이언트</w:t>
+            </w:r>
+          </w:p>
+          <w:p>
+            <w:pPr>
+              <w:spacing w:after="60" w:line="300" w:lineRule="auto"/>
+            </w:pPr>
+            <w:r>
+              <w:rPr>
+                <w:rFonts w:ascii="맑은 고딕" w:hAnsi="맑은 고딕" w:eastAsia="맑은 고딕"/>
+                <w:b/>
+                <w:color w:val="1A365D"/>
+                <w:sz w:val="19"/>
+              </w:rPr>
+              <w:t xml:space="preserve">• </w:t>
+            </w:r>
+            <w:r>
+              <w:rPr>
+                <w:rFonts w:ascii="맑은 고딕" w:hAnsi="맑은 고딕" w:eastAsia="맑은 고딕"/>
+                <w:b w:val="0"/>
+                <w:color w:val="2D3748"/>
+                <w:sz w:val="19"/>
+              </w:rPr>
+              <w:t>VS Code (Visual Studio Code): 전체 프로젝트의 통합 개발 환경(IDE), FastMCP 로컬 디버깅 및 에이전틱 코딩 워크스페이스로 활용</w:t>
+            </w:r>
+          </w:p>
+          <w:p>
+            <w:pPr>
+              <w:spacing w:after="60" w:line="300" w:lineRule="auto"/>
+            </w:pPr>
+            <w:r>
+              <w:rPr>
+                <w:rFonts w:ascii="맑은 고딕" w:hAnsi="맑은 고딕" w:eastAsia="맑은 고딕"/>
+                <w:b/>
+                <w:color w:val="1A365D"/>
+                <w:sz w:val="19"/>
+              </w:rPr>
+              <w:t xml:space="preserve">• </w:t>
+            </w:r>
+            <w:r>
+              <w:rPr>
+                <w:rFonts w:ascii="맑은 고딕" w:hAnsi="맑은 고딕" w:eastAsia="맑은 고딕"/>
+                <w:b w:val="0"/>
+                <w:color w:val="2D3748"/>
+                <w:sz w:val="19"/>
+              </w:rPr>
+              <w:t>Codex-GPT: 5대 공종 안전율/허용응력 AST 검산 알고리즘 및 복잡한 정규표현식 파라미터 추출 로직 구현 보조</w:t>
+            </w:r>
+          </w:p>
+          <w:p>
+            <w:pPr>
+              <w:spacing w:after="60" w:line="300" w:lineRule="auto"/>
+            </w:pPr>
+            <w:r>
+              <w:rPr>
+                <w:rFonts w:ascii="맑은 고딕" w:hAnsi="맑은 고딕" w:eastAsia="맑은 고딕"/>
+                <w:b/>
+                <w:color w:val="1A365D"/>
+                <w:sz w:val="19"/>
+              </w:rPr>
+              <w:t xml:space="preserve">• </w:t>
+            </w:r>
+            <w:r>
+              <w:rPr>
+                <w:rFonts w:ascii="맑은 고딕" w:hAnsi="맑은 고딕" w:eastAsia="맑은 고딕"/>
+                <w:b w:val="0"/>
+                <w:color w:val="2D3748"/>
+                <w:sz w:val="19"/>
+              </w:rPr>
+              <w:t>ASTRA: 건설 엔지니어링 질의응답 및 감리 실무 프롬프트 워크플로우 최적화 분석 도구로 활용</w:t>
             </w:r>
           </w:p>
           <w:p>
@@ -2541,6 +2610,66 @@
                 <w:sz w:val="19"/>
               </w:rPr>
               <w:t>이번 프로젝트를 통해 검증된 'FastMCP 기반 로컬 Sandbox + Python 직접 연산 + 프로젝트 메모리 DB' 방식은 각 감리원마다 '자신만의 현장 전담 비서'를 갖게 해줌으로써, 중앙 RAG 방식의 한계를 100% 극복할 수 있음을 확인했습니다.</w:t>
+            </w:r>
+          </w:p>
+          <w:p>
+            <w:pPr>
+              <w:spacing w:before="120" w:after="60" w:line="288" w:lineRule="auto"/>
+            </w:pPr>
+            <w:r>
+              <w:rPr>
+                <w:rFonts w:ascii="맑은 고딕" w:hAnsi="맑은 고딕" w:eastAsia="맑은 고딕"/>
+                <w:b/>
+                <w:color w:val="2B6CB0"/>
+                <w:sz w:val="20"/>
+              </w:rPr>
+              <w:t>▶ 향후 핵심 과제 및 단점 보완: 사내 보안 프로그램(DRM) 암호화 문서 지원 요청</w:t>
+            </w:r>
+          </w:p>
+          <w:p>
+            <w:pPr>
+              <w:spacing w:after="60" w:line="300" w:lineRule="auto"/>
+            </w:pPr>
+            <w:r>
+              <w:rPr>
+                <w:rFonts w:ascii="맑은 고딕" w:hAnsi="맑은 고딕" w:eastAsia="맑은 고딕"/>
+                <w:b/>
+                <w:color w:val="1A365D"/>
+                <w:sz w:val="19"/>
+              </w:rPr>
+              <w:t xml:space="preserve">• </w:t>
+            </w:r>
+            <w:r>
+              <w:rPr>
+                <w:rFonts w:ascii="맑은 고딕" w:hAnsi="맑은 고딕" w:eastAsia="맑은 고딕"/>
+                <w:b w:val="0"/>
+                <w:color w:val="2D3748"/>
+                <w:sz w:val="19"/>
+              </w:rPr>
+              <w:t>현재 겪고 있는 기술적 한계: 삼우씨엠 사내 보안 프로그램(문서보안 DRM)으로 암호화가 적용된 파일(HWPX, XLSX, DOCX, PDF)의 경우, 로컬 오픈소스 파서가 복호화 키 없이 직접 읽을 수 없어 현재는 감리원이 수동으로 복호화한 후 검토를 수행해야 하는 현실적 번거로움이 있습니다.</w:t>
+            </w:r>
+          </w:p>
+          <w:p>
+            <w:pPr>
+              <w:spacing w:after="60" w:line="300" w:lineRule="auto"/>
+            </w:pPr>
+            <w:r>
+              <w:rPr>
+                <w:rFonts w:ascii="맑은 고딕" w:hAnsi="맑은 고딕" w:eastAsia="맑은 고딕"/>
+                <w:b/>
+                <w:color w:val="1A365D"/>
+                <w:sz w:val="19"/>
+              </w:rPr>
+              <w:t xml:space="preserve">• </w:t>
+            </w:r>
+            <w:r>
+              <w:rPr>
+                <w:rFonts w:ascii="맑은 고딕" w:hAnsi="맑은 고딕" w:eastAsia="맑은 고딕"/>
+                <w:b w:val="0"/>
+                <w:color w:val="2D3748"/>
+                <w:sz w:val="19"/>
+              </w:rPr>
+              <w:t>본사 차원의 지원 요청 건의: 사내 보안 정책을 철저히 준수하면서도 현장 감리원이 편리하게 활용할 수 있도록, 본사 정보보안팀과 협의하여 승인된 로컬 프로세스 내에서 암호화 문서를 안전하게 메모리 상에서 파싱할 수 있는 '사내 공식 DRM 복호화 API 연동' 또는 '보안 인증 모듈 지원'을 강력히 건의드립니다. 이 연동이 이루어지면 암호화 도서까지 원클릭으로 전수 검토하는 완전무결한 시스템으로 도약할 수 있습니다.</w:t>
             </w:r>
           </w:p>
           <w:p>

</xml_diff>